<commit_message>
docs(report): sync report with 4-page demo app and retrained_v2 notes
- Muc 5.4: ung dung con 4 phan he (gop Benchmark vao Mo hinh & danh gia)
- Muc 4.8: ghi ro 4 mo hinh con lai chua xep hang lai tren tien xu ly moi
- eda_feature_engineering.md: ghi chu phien ban tu dung goc va ban hieu chinh
- Ke hoach TV2: nhat ky cap nhat 25/09
</commit_message>
<xml_diff>
--- a/reports/final_report/Bao_Cao_Do_An_May_Hoc_ITviec.docx
+++ b/reports/final_report/Bao_Cao_Do_An_May_Hoc_ITviec.docx
@@ -18708,7 +18708,7 @@
         <w:t xml:space="preserve">ít</w:t>
       </w:r>
       <w:r>
-        <w:t xml:space="preserve"> chủ yếu mang sắc thái tiêu cực. Ứng dụng minh họa sử dụng bản hiệu chỉnh này. Các phân tích ở Chương 5 được thực hiện trên bản gốc để giữ nhất quán với kết quả kiểm thử độc lập.</w:t>
+        <w:t xml:space="preserve"> chủ yếu mang sắc thái tiêu cực. Bốn mô hình còn lại chưa được xếp hạng lại trên đặc trưng của bản hiệu chỉnh, do đó bảng xếp hạng ở Bảng 4.1 chỉ có giá trị với tiền xử lý gốc. Ứng dụng minh họa sử dụng bản hiệu chỉnh này. Các phân tích ở Chương 5 được thực hiện trên bản gốc để giữ nhất quán với kết quả kiểm thử độc lập.</w:t>
       </w:r>
     </w:p>
     <w:p>
@@ -23357,7 +23357,7 @@
         <w:jc w:val="both"/>
       </w:pPr>
       <w:r>
-        <w:t xml:space="preserve">Ứng dụng web được xây dựng bằng Streamlit, gồm năm phân hệ:</w:t>
+        <w:t xml:space="preserve">Ứng dụng web được xây dựng bằng Streamlit, gồm bốn phân hệ:</w:t>
       </w:r>
     </w:p>
     <w:p>
@@ -23417,10 +23417,10 @@
           <w:b/>
           <w:bCs/>
         </w:rPr>
-        <w:t xml:space="preserve">Benchmark.</w:t>
-      </w:r>
-      <w:r>
-        <w:t xml:space="preserve"> So sánh năm mô hình theo Macro F1 CV và thời gian huấn luyện.</w:t>
+        <w:t xml:space="preserve">Mô hình và đánh giá.</w:t>
+      </w:r>
+      <w:r>
+        <w:t xml:space="preserve"> So sánh năm mô hình theo Macro F1 CV kèm biên độ ±1 độ lệch chuẩn giữa các fold, sau đó hiển thị kết quả trên tập kiểm thử, ma trận nhầm lẫn, chỉ số theo lớp và các mẫu lỗi.</w:t>
       </w:r>
     </w:p>
     <w:p>
@@ -23438,31 +23438,10 @@
           <w:b/>
           <w:bCs/>
         </w:rPr>
-        <w:t xml:space="preserve">Đánh giá.</w:t>
-      </w:r>
-      <w:r>
-        <w:t xml:space="preserve"> Hiển thị kết quả trên tập kiểm thử, ma trận nhầm lẫn và các mẫu lỗi.</w:t>
-      </w:r>
-    </w:p>
-    <w:p>
-      <w:pPr>
-        <w:pStyle w:val="ListParagraph"/>
-        <w:numPr>
-          <w:ilvl w:val="0"/>
-          <w:numId w:val="7"/>
-        </w:numPr>
-        <w:spacing w:after="80" w:line="312"/>
-        <w:jc w:val="both"/>
-      </w:pPr>
-      <w:r>
-        <w:rPr>
-          <w:b/>
-          <w:bCs/>
-        </w:rPr>
-        <w:t xml:space="preserve">Dự đoán thời gian thực.</w:t>
-      </w:r>
-      <w:r>
-        <w:t xml:space="preserve"> Người dùng nhập một đánh giá bất kỳ và nhận nhãn dự đoán kèm xác suất ba lớp.</w:t>
+        <w:t xml:space="preserve">Phân tích review.</w:t>
+      </w:r>
+      <w:r>
+        <w:t xml:space="preserve"> Người dùng nhập một đánh giá bất kỳ và nhận nhãn dự đoán kèm xác suất ba lớp, văn bản sau tiền xử lý và các token TF-IDF nổi bật.</w:t>
       </w:r>
     </w:p>
     <w:p>

</xml_diff>